<commit_message>
add past exam papers for multiple courses
</commit_message>
<xml_diff>
--- a/学科资料/信息安全数学基础/信息安全数学基础2025回忆版.docx
+++ b/学科资料/信息安全数学基础/信息安全数学基础2025回忆版.docx
@@ -8015,7 +8015,6 @@
       <w:pPr>
         <w:spacing w:line="360" w:lineRule="auto"/>
         <w:rPr>
-          <w:rFonts w:hint="eastAsia"/>
           <w:sz w:val="24"/>
           <w:lang w:val="sv-SE"/>
         </w:rPr>
@@ -9684,18 +9683,8 @@
           <w:bCs/>
           <w:sz w:val="24"/>
         </w:rPr>
-        <w:t>公</w:t>
-      </w:r>
-      <w:proofErr w:type="gramStart"/>
-      <w:r>
-        <w:rPr>
-          <w:rFonts w:hint="eastAsia"/>
-          <w:bCs/>
-          <w:sz w:val="24"/>
-        </w:rPr>
-        <w:t>钥</w:t>
-      </w:r>
-      <w:proofErr w:type="gramEnd"/>
+        <w:t>公钥</w:t>
+      </w:r>
       <w:r>
         <w:rPr>
           <w:bCs/>
@@ -9924,154 +9913,7 @@
       <w:pPr>
         <w:spacing w:line="360" w:lineRule="auto"/>
         <w:rPr>
-          <w:bCs/>
-          <w:sz w:val="24"/>
-        </w:rPr>
-      </w:pPr>
-    </w:p>
-    <w:p>
-      <w:pPr>
-        <w:spacing w:line="360" w:lineRule="auto"/>
-        <w:rPr>
-          <w:bCs/>
-          <w:sz w:val="24"/>
-        </w:rPr>
-      </w:pPr>
-    </w:p>
-    <w:p>
-      <w:pPr>
-        <w:spacing w:line="360" w:lineRule="auto"/>
-        <w:rPr>
-          <w:bCs/>
-          <w:sz w:val="24"/>
-        </w:rPr>
-      </w:pPr>
-    </w:p>
-    <w:p>
-      <w:pPr>
-        <w:spacing w:line="360" w:lineRule="auto"/>
-        <w:rPr>
-          <w:bCs/>
-          <w:sz w:val="24"/>
-        </w:rPr>
-      </w:pPr>
-    </w:p>
-    <w:p>
-      <w:pPr>
-        <w:spacing w:line="360" w:lineRule="auto"/>
-        <w:rPr>
-          <w:bCs/>
-          <w:sz w:val="24"/>
-        </w:rPr>
-      </w:pPr>
-    </w:p>
-    <w:p>
-      <w:pPr>
-        <w:spacing w:line="360" w:lineRule="auto"/>
-        <w:ind w:firstLineChars="200" w:firstLine="480"/>
-      </w:pPr>
-      <w:r>
-        <w:rPr>
-          <w:sz w:val="24"/>
-        </w:rPr>
-        <w:t>3</w:t>
-      </w:r>
-      <w:r>
-        <w:rPr>
-          <w:sz w:val="24"/>
-        </w:rPr>
-        <w:t>．</w:t>
-      </w:r>
-      <w:r>
-        <w:rPr>
-          <w:rFonts w:hint="eastAsia"/>
-          <w:bCs/>
-          <w:sz w:val="24"/>
-        </w:rPr>
-        <w:t>求</w:t>
-      </w:r>
-      <w:r>
-        <w:rPr>
-          <w:bCs/>
-          <w:sz w:val="24"/>
-        </w:rPr>
-        <w:t>1</w:t>
-      </w:r>
-      <w:r>
-        <w:rPr>
-          <w:bCs/>
-          <w:sz w:val="24"/>
-        </w:rPr>
-        <w:t>7</w:t>
-      </w:r>
-      <w:r>
-        <w:rPr>
-          <w:rFonts w:hint="eastAsia"/>
-          <w:bCs/>
-          <w:sz w:val="24"/>
-        </w:rPr>
-        <w:t>的倍数，使得该数被</w:t>
-      </w:r>
-      <w:r>
-        <w:rPr>
-          <w:bCs/>
-          <w:sz w:val="24"/>
-        </w:rPr>
-        <w:t>2, 3, 5</w:t>
-      </w:r>
-      <w:r>
-        <w:rPr>
-          <w:rFonts w:hint="eastAsia"/>
-          <w:bCs/>
-          <w:sz w:val="24"/>
-        </w:rPr>
-        <w:t>除的余数为</w:t>
-      </w:r>
-      <w:r>
-        <w:rPr>
-          <w:bCs/>
-          <w:sz w:val="24"/>
-        </w:rPr>
-        <w:t>1</w:t>
-      </w:r>
-      <w:r>
-        <w:rPr>
-          <w:rFonts w:hint="eastAsia"/>
-          <w:bCs/>
-          <w:sz w:val="24"/>
-        </w:rPr>
-        <w:t>。</w:t>
-      </w:r>
-      <w:r>
-        <w:rPr>
-          <w:rFonts w:hint="eastAsia"/>
-        </w:rPr>
-        <w:t xml:space="preserve">          </w:t>
-      </w:r>
-      <w:r>
-        <w:rPr>
-          <w:sz w:val="24"/>
-        </w:rPr>
-        <w:t>（</w:t>
-      </w:r>
-      <w:r>
-        <w:rPr>
-          <w:sz w:val="24"/>
-        </w:rPr>
-        <w:t>10</w:t>
-      </w:r>
-      <w:r>
-        <w:rPr>
-          <w:sz w:val="24"/>
-        </w:rPr>
-        <w:t>分）</w:t>
-      </w:r>
-    </w:p>
-    <w:p>
-      <w:pPr>
-        <w:spacing w:line="360" w:lineRule="auto"/>
-        <w:ind w:leftChars="200" w:left="420"/>
-        <w:rPr>
+          <w:rFonts w:hint="eastAsia"/>
           <w:bCs/>
           <w:sz w:val="24"/>
         </w:rPr>

</xml_diff>